<commit_message>
Vacante CM: envio por correo a citasheiiu@gmail.com asunto Vacante CM
Co-Authored-By: Claude Opus 5.5 <noreply@anthropic.com>
</commit_message>
<xml_diff>
--- a/recursos/comercial/contratacion/COMMUNITY_MANAGER/MENSAJE_VACANTE_COMMUNITY_MANAGER.docx
+++ b/recursos/comercial/contratacion/COMMUNITY_MANAGER/MENSAJE_VACANTE_COMMUNITY_MANAGER.docx
@@ -448,6 +448,20 @@
           <w:b/>
           <w:sz w:val="22"/>
         </w:rPr>
+        <w:t>un solo correo a citasheiiu@gmail.com con el asunto "Vacante CM"</w:t>
+      </w:r>
+      <w:r>
+        <w:rPr>
+          <w:b w:val="0"/>
+          <w:sz w:val="22"/>
+        </w:rPr>
+        <w:t xml:space="preserve">, </w:t>
+      </w:r>
+      <w:r>
+        <w:rPr>
+          <w:b/>
+          <w:sz w:val="22"/>
+        </w:rPr>
         <w:t>antes del [día] a las [hora]</w:t>
       </w:r>
       <w:r>
@@ -455,7 +469,7 @@
           <w:b w:val="0"/>
           <w:sz w:val="22"/>
         </w:rPr>
-        <w:t>:</w:t>
+        <w:t>, con:</w:t>
       </w:r>
     </w:p>
     <w:p>
@@ -563,19 +577,7 @@
         <w:rPr>
           <w:b w:val="0"/>
         </w:rPr>
-        <w:t xml:space="preserve">. Envíalo como </w:t>
-      </w:r>
-      <w:r>
-        <w:rPr>
-          <w:b/>
-        </w:rPr>
-        <w:t>documento</w:t>
-      </w:r>
-      <w:r>
-        <w:rPr>
-          <w:b w:val="0"/>
-        </w:rPr>
-        <w:t xml:space="preserve"> por WhatsApp o como enlace de Drive, para que no pierda calidad.</w:t>
+        <w:t>. Adjúntalo al correo o envía el enlace de Google Drive (con acceso abierto), para que no pierda calidad.</w:t>
       </w:r>
     </w:p>
     <w:p>
@@ -599,7 +601,7 @@
           <w:b w:val="0"/>
           <w:sz w:val="22"/>
         </w:rPr>
-        <w:t>Si no recibimos los 5 puntos, no podremos continuar con tu proceso. ¡Gracias!</w:t>
+        <w:t>Si el correo no tiene el asunto "Vacante CM" o no incluye los 5 puntos, no podremos continuar con tu proceso. ¡Gracias!</w:t>
       </w:r>
     </w:p>
     <w:p>
@@ -625,7 +627,7 @@
           <w:color w:val="666666"/>
           <w:sz w:val="20"/>
         </w:rPr>
-        <w:t>1. No mandó los 5 puntos → fuera (si no sigue una instrucción simple, no cumple una parrilla).</w:t>
+        <w:t>1. No mandó los 5 puntos o no puso el asunto "Vacante CM" → fuera (si no sigue una instrucción simple, no cumple una parrilla).</w:t>
       </w:r>
     </w:p>
     <w:p>

</xml_diff>

<commit_message>
Vacante CM: Word regenerado en una sola version
Co-Authored-By: Claude Opus 5.5 <noreply@anthropic.com>
</commit_message>
<xml_diff>
--- a/recursos/comercial/contratacion/COMMUNITY_MANAGER/MENSAJE_VACANTE_COMMUNITY_MANAGER.docx
+++ b/recursos/comercial/contratacion/COMMUNITY_MANAGER/MENSAJE_VACANTE_COMMUNITY_MANAGER.docx
@@ -408,14 +408,28 @@
           <w:b/>
           <w:sz w:val="22"/>
         </w:rPr>
-        <w:t>$1.800.000 mensuales</w:t>
+        <w:t>$1.800.000 mensuales en total por las dos marcas</w:t>
       </w:r>
       <w:r>
         <w:rPr>
           <w:b w:val="0"/>
           <w:sz w:val="22"/>
         </w:rPr>
-        <w:t xml:space="preserve">. Se requiere </w:t>
+        <w:t xml:space="preserve">, con </w:t>
+      </w:r>
+      <w:r>
+        <w:rPr>
+          <w:b/>
+          <w:sz w:val="22"/>
+        </w:rPr>
+        <w:t>revisión al tercer mes</w:t>
+      </w:r>
+      <w:r>
+        <w:rPr>
+          <w:b w:val="0"/>
+          <w:sz w:val="22"/>
+        </w:rPr>
+        <w:t xml:space="preserve"> según el cumplimiento de los mínimos y los resultados del contenido. Se requiere </w:t>
       </w:r>
       <w:r>
         <w:rPr>

</xml_diff>

<commit_message>
Vacante CM: aclarar que no es tiempo completo ni contrato laboral
Co-Authored-By: Claude Opus 5.5 <noreply@anthropic.com>
</commit_message>
<xml_diff>
--- a/recursos/comercial/contratacion/COMMUNITY_MANAGER/MENSAJE_VACANTE_COMMUNITY_MANAGER.docx
+++ b/recursos/comercial/contratacion/COMMUNITY_MANAGER/MENSAJE_VACANTE_COMMUNITY_MANAGER.docx
@@ -338,14 +338,14 @@
           <w:b/>
           <w:sz w:val="22"/>
         </w:rPr>
-        <w:t>Modalidad:</w:t>
+        <w:t>Modalidad: NO es tiempo completo ni contrato laboral.</w:t>
       </w:r>
       <w:r>
         <w:rPr>
           <w:b w:val="0"/>
           <w:sz w:val="22"/>
         </w:rPr>
-        <w:t xml:space="preserve"> prestación de servicios, </w:t>
+        <w:t xml:space="preserve"> Es prestación de servicios por entregables, </w:t>
       </w:r>
       <w:r>
         <w:rPr>
@@ -387,21 +387,21 @@
           <w:b w:val="0"/>
           <w:sz w:val="22"/>
         </w:rPr>
-        <w:t xml:space="preserve">, agendadas cada semana. </w:t>
+        <w:t xml:space="preserve">, agendadas cada semana según tu disponibilidad y el horario de clases. </w:t>
       </w:r>
       <w:r>
         <w:rPr>
           <w:b/>
           <w:sz w:val="22"/>
         </w:rPr>
-        <w:t>La edición se hace de forma remota.</w:t>
+        <w:t>La edición se hace de forma remota, en tus tiempos; no hay horario fijo de oficina.</w:t>
       </w:r>
       <w:r>
         <w:rPr>
           <w:b w:val="0"/>
           <w:sz w:val="22"/>
         </w:rPr>
-        <w:t xml:space="preserve"> Disponibilidad prioritaria de lunes a sábado. Honorarios: </w:t>
+        <w:t xml:space="preserve"> Honorarios: </w:t>
       </w:r>
       <w:r>
         <w:rPr>

</xml_diff>